<commit_message>
Add Nexora web app link to CV and website button to portfolio
</commit_message>
<xml_diff>
--- a/assets/pdfs/Mahmoud Fahmy.docx
+++ b/assets/pdfs/Mahmoud Fahmy.docx
@@ -3298,6 +3298,26 @@
             <w:u w:val="single"/>
           </w:rPr>
           <w:t>Source Code</w:t>
+        </w:r>
+      </w:hyperlink>
+      <w:r>
+        <w:t xml:space="preserve">  </w:t>
+      </w:r>
+      <w:r>
+        <w:t xml:space="preserve">|</w:t>
+      </w:r>
+      <w:r>
+        <w:t xml:space="preserve">  </w:t>
+      </w:r>
+      <w:hyperlink r:id="rId33" w:tgtFrame="_blank" w:history="1">
+        <w:r>
+          <w:rPr>
+            <w:w w:val="115"/>
+            <w:sz w:val="24"/>
+            <w:szCs w:val="24"/>
+            <w:u w:val="single"/>
+          </w:rPr>
+          <w:t xml:space="preserve">Web App</w:t>
         </w:r>
       </w:hyperlink>
       <w:r>

</xml_diff>